<commit_message>
fixing curriculum vitae path
</commit_message>
<xml_diff>
--- a/src/assets/curriculum-vitae/Curriculum Vitae - Pedro Miguel.docx
+++ b/src/assets/curriculum-vitae/Curriculum Vitae - Pedro Miguel.docx
@@ -510,7 +510,7 @@
         <w:t>OBJETIVO</w:t>
       </w:r>
     </w:p>
-    <w:p xmlns:wp14="http://schemas.microsoft.com/office/word/2010/wordml" wp14:textId="43E06F94">
+    <w:p xmlns:wp14="http://schemas.microsoft.com/office/word/2010/wordml" wp14:textId="360649BD">
       <w:pPr>
         <w:pStyle w:val="BodyText"/>
         <w:spacing w:before="28" w:after="0"/>
@@ -609,7 +609,28 @@
           <w:rFonts w:ascii="Arial" w:hAnsi="Arial"/>
           <w:spacing w:val="-2"/>
         </w:rPr>
-        <w:t xml:space="preserve"> com foco em Back-end</w:t>
+        <w:t xml:space="preserve"> com foco em </w:t>
+      </w:r>
+      <w:r>
+        <w:rPr>
+          <w:rFonts w:ascii="Arial" w:hAnsi="Arial"/>
+          <w:spacing w:val="-2"/>
+        </w:rPr>
+        <w:t xml:space="preserve">Back</w:t>
+      </w:r>
+      <w:r>
+        <w:rPr>
+          <w:rFonts w:ascii="Arial" w:hAnsi="Arial"/>
+          <w:spacing w:val="-2"/>
+        </w:rPr>
+        <w:t xml:space="preserve">-</w:t>
+      </w:r>
+      <w:r>
+        <w:rPr>
+          <w:rFonts w:ascii="Arial" w:hAnsi="Arial"/>
+          <w:spacing w:val="-2"/>
+        </w:rPr>
+        <w:t xml:space="preserve">stack</w:t>
       </w:r>
     </w:p>
     <w:p xmlns:wp14="http://schemas.microsoft.com/office/word/2010/wordml" wp14:textId="77777777">
@@ -764,7 +785,7 @@
         <w:t>Atual</w:t>
       </w:r>
     </w:p>
-    <w:p xmlns:wp14="http://schemas.microsoft.com/office/word/2010/wordml" wp14:textId="12F65921">
+    <w:p xmlns:wp14="http://schemas.microsoft.com/office/word/2010/wordml" wp14:textId="58A7D95C">
       <w:pPr>
         <w:pStyle w:val="ListParagraph"/>
         <w:numPr>
@@ -830,23 +851,15 @@
           <w:sz w:val="20"/>
           <w:szCs w:val="20"/>
         </w:rPr>
-        <w:t xml:space="preserve">bem como ter </w:t>
-      </w:r>
-      <w:r>
-        <w:rPr>
-          <w:rFonts w:ascii="Arial" w:hAnsi="Arial"/>
-          <w:sz w:val="20"/>
-          <w:szCs w:val="20"/>
-        </w:rPr>
-        <w:t>realiza</w:t>
-      </w:r>
-      <w:r>
-        <w:rPr>
-          <w:rFonts w:ascii="Arial" w:hAnsi="Arial"/>
-          <w:sz w:val="20"/>
-          <w:szCs w:val="20"/>
-        </w:rPr>
-        <w:t>do</w:t>
+        <w:t xml:space="preserve">bem como</w:t>
+      </w:r>
+      <w:r>
+        <w:rPr>
+          <w:rFonts w:ascii="Arial" w:hAnsi="Arial"/>
+          <w:sz w:val="20"/>
+          <w:szCs w:val="20"/>
+        </w:rPr>
+        <w:t xml:space="preserve"> realizei </w:t>
       </w:r>
       <w:r>
         <w:rPr>
@@ -855,15 +868,6 @@
           <w:sz w:val="20"/>
           <w:szCs w:val="20"/>
         </w:rPr>
-        <w:t xml:space="preserve"> </w:t>
-      </w:r>
-      <w:r>
-        <w:rPr>
-          <w:rFonts w:ascii="Arial" w:hAnsi="Arial"/>
-          <w:spacing w:val="-5"/>
-          <w:sz w:val="20"/>
-          <w:szCs w:val="20"/>
-        </w:rPr>
         <w:t xml:space="preserve">mais de 5 </w:t>
       </w:r>
       <w:r>
@@ -908,15 +912,6 @@
           <w:szCs w:val="20"/>
         </w:rPr>
         <w:t xml:space="preserve">conduzi</w:t>
-      </w:r>
-      <w:r>
-        <w:rPr>
-          <w:rFonts w:ascii="Arial" w:hAnsi="Arial"/>
-          <w:spacing w:val="-3"/>
-          <w:sz w:val="20"/>
-          <w:szCs w:val="20"/>
-        </w:rPr>
-        <w:t xml:space="preserve">do</w:t>
       </w:r>
       <w:r>
         <w:rPr>

</xml_diff>